<commit_message>
Export: tái xuất 7 báo cáo khảo sát 08–17/06 — QC 23/23 PASS (văn phong Việt hóa hoàn tất)
Co-Authored-By: Claude Sonnet 4.6 <noreply@anthropic.com>
</commit_message>
<xml_diff>
--- a/ba/sync/output/human/exports/BAO-CAO-KHAO-SAT-TOSS-08062026-v0.2-2026-06-17.docx
+++ b/ba/sync/output/human/exports/BAO-CAO-KHAO-SAT-TOSS-08062026-v0.2-2026-06-17.docx
@@ -209,7 +209,7 @@
         <w:pStyle w:val="BodyText"/>
       </w:pPr>
       <w:r>
-        <w:t xml:space="preserve">Để vào khảo sát từng đơn vị, hai bên thống nhất cách làm là gửi trước bộ câu hỏi khảo sát đã được chuẩn bị sẵn cho đơn vị, kèm công văn đề nghị bố trí người và tài liệu hệ thống. Cách làm này được đánh giá là giúp đơn vị chủ động chuẩn bị, tránh tình trạng đến nơi mới hỏi và người được hỏi không nắm rõ nội dung. Nhóm triển khai cũng đề xuất một đến hai buổi đầu sẽ làm việc overview với từng team để xác định ưu tiên triển khai, phân loại nội dung đã rõ thông tin và nội dung chưa rõ, sau đó mới đi vào chi tiết.</w:t>
+        <w:t xml:space="preserve">Để vào khảo sát từng đơn vị, hai bên thống nhất cách làm là gửi trước bộ câu hỏi khảo sát đã được chuẩn bị sẵn cho đơn vị, kèm công văn đề nghị bố trí người và tài liệu hệ thống. Cách làm này được đánh giá là giúp đơn vị chủ động chuẩn bị, tránh tình trạng đến nơi mới hỏi và người được hỏi không nắm rõ nội dung. Nhóm triển khai cũng đề xuất một đến hai buổi đầu sẽ làm việc tổng quan với từng nhóm đơn vị để xác định ưu tiên triển khai, phân loại nội dung đã rõ thông tin và nội dung chưa rõ, sau đó mới đi vào chi tiết.</w:t>
       </w:r>
     </w:p>
     <w:p>
@@ -349,7 +349,7 @@
         <w:pStyle w:val="BodyText"/>
       </w:pPr>
       <w:r>
-        <w:t xml:space="preserve">Về nguyên tắc xử lý, những gì có thể tự động tổng hợp thì hệ thống tự động, còn những thông tin chỉ con người mới có như sương mù tại sân bay Hà Nội làm mười chuyến không cất cánh được trong khung giờ 7 giờ đến 8 giờ thì hệ thống cần cung cấp chức năng cho đơn vị nhập tay, sau đó dữ liệu này được tái sử dụng cho mọi báo cáo. Về phát hành báo cáo, sau khi hệ thống tổng hợp tự động, người dùng review và publish, hệ thống gửi qua thư điện tử đến địa chỉ đã cấu hình sẵn, không yêu cầu ký số. Ngoài ra, công cụ Evo Report do bên Hãng tự xây trước đây để rút dữ liệu lịch bay từ NetLine hiện đã đáp ứng được khoảng của nhu cầu, nhưng vẫn còn vấn đề lệch số liệu giữa các báo cáo.</w:t>
+        <w:t xml:space="preserve">Về nguyên tắc xử lý, những gì có thể tự động tổng hợp thì hệ thống tự động, còn những thông tin chỉ con người mới có như sương mù tại sân bay Hà Nội làm mười chuyến không cất cánh được trong khung giờ 7 giờ đến 8 giờ thì hệ thống cần cung cấp chức năng cho đơn vị nhập tay, sau đó dữ liệu này được tái sử dụng cho mọi báo cáo. Về phát hành báo cáo, sau khi hệ thống tổng hợp tự động, người dùng rà soát và phát hành, hệ thống gửi qua thư điện tử đến địa chỉ đã cấu hình sẵn, không yêu cầu ký số. Ngoài ra, công cụ Evo Report do bên Hãng tự xây trước đây để rút dữ liệu lịch bay từ NetLine hiện đã đáp ứng được khoảng của nhu cầu, nhưng vẫn còn vấn đề lệch số liệu giữa các báo cáo.</w:t>
       </w:r>
     </w:p>
     <w:p>
@@ -753,7 +753,7 @@
         <w:pStyle w:val="BodyText"/>
       </w:pPr>
       <w:r>
-        <w:t xml:space="preserve">Phía Hãng làm rõ rằng phân quyền của TOSS chỉ áp dụng theo chức năng, không phân quyền theo dữ liệu hay theo chuyến bay. Cơ chế này khác với hệ MO hiện tại, nơi MO chỉ phân biệt được vai trò append và review nhưng không phân theo PIC hay Purser hay chuyến cụ thể. Tuy nhiên trong một số trường hợp như đại diện sân bay, hệ thống cần lọc theo sân bay mà người đó phụ trách để hiển thị các chuyến bay đi và đến từ sân bay đó.</w:t>
+        <w:t xml:space="preserve">Phía Hãng làm rõ rằng phân quyền của TOSS chỉ áp dụng theo chức năng, không phân quyền theo dữ liệu hay theo chuyến bay. Cơ chế này khác với hệ MO hiện tại, nơi MO chỉ phân biệt được vai trò bổ sung và rà soát nhưng không phân theo PIC hay Purser hay chuyến cụ thể. Tuy nhiên trong một số trường hợp như đại diện sân bay, hệ thống cần lọc theo sân bay mà người đó phụ trách để hiển thị các chuyến bay đi và đến từ sân bay đó.</w:t>
       </w:r>
     </w:p>
     <w:p>

</xml_diff>